<commit_message>
update: ATS-compliant FDE resumes and cover letters - removed character spacing, tables, unicode
Generated with BEACON
</commit_message>
<xml_diff>
--- a/Adish_Vasudeva_FDE_Resume.docx
+++ b/Adish_Vasudeva_FDE_Resume.docx
@@ -13,7 +13,6 @@
           <w:b/>
           <w:bCs/>
           <w:color w:val="2D2D2D"/>
-          <w:spacing w:val="80"/>
           <w:sz w:val="50"/>
           <w:szCs w:val="50"/>
         </w:rPr>
@@ -31,7 +30,6 @@
           <w:b/>
           <w:bCs/>
           <w:color w:val="2563EB"/>
-          <w:spacing w:val="60"/>
           <w:sz w:val="20"/>
           <w:szCs w:val="20"/>
         </w:rPr>
@@ -69,7 +67,6 @@
           <w:b/>
           <w:bCs/>
           <w:color w:val="2563EB"/>
-          <w:spacing w:val="40"/>
           <w:sz w:val="23"/>
           <w:szCs w:val="23"/>
         </w:rPr>
@@ -87,7 +84,7 @@
           <w:sz w:val="20"/>
           <w:szCs w:val="20"/>
         </w:rPr>
-        <w:t xml:space="preserve">Full-stack engineer with 8+ years of experience building and deploying customer-facing data platforms, analytics tools, and AI-powered solutions directly at client sites. Proven ability to translate ambiguous business problems into production-grade software — from initial discovery through architecture, rapid prototyping, deployment on cloud infrastructure (AWS/Azure), and ongoing iteration based on stakeholder feedback. Deep domain expertise in automotive data systems, autonomous driving validation, and real-time signal processing. Thrive at the intersection of engineering, product, and client success.</w:t>
+        <w:t xml:space="preserve">Full-stack engineer with 8+ years of experience building and deploying customer-facing data platforms, analytics tools, and AI-powered solutions directly at client sites. Proven ability to translate ambiguous business problems into production-grade software -- from initial discovery through architecture, rapid prototyping, deployment on cloud infrastructure (AWS/Azure), and ongoing iteration based on stakeholder feedback. Deep domain expertise in automotive data systems, autonomous driving validation, and real-time signal processing. Thrive at the intersection of engineering, product, and client success.</w:t>
       </w:r>
     </w:p>
     <w:p>
@@ -103,338 +100,54 @@
           <w:b/>
           <w:bCs/>
           <w:color w:val="2563EB"/>
-          <w:spacing w:val="40"/>
           <w:sz w:val="23"/>
           <w:szCs w:val="23"/>
         </w:rPr>
         <w:t xml:space="preserve">CORE COMPETENCIES</w:t>
       </w:r>
     </w:p>
-    <w:tbl>
-      <w:tblPr>
-        <w:tblW w:type="dxa" w:w="9600"/>
-        <w:tblBorders>
-          <w:top w:val="single" w:color="auto" w:sz="4"/>
-          <w:left w:val="single" w:color="auto" w:sz="4"/>
-          <w:bottom w:val="single" w:color="auto" w:sz="4"/>
-          <w:right w:val="single" w:color="auto" w:sz="4"/>
-          <w:insideH w:val="single" w:color="auto" w:sz="4"/>
-          <w:insideV w:val="single" w:color="auto" w:sz="4"/>
-        </w:tblBorders>
-      </w:tblPr>
-      <w:tblGrid>
-        <w:gridCol w:w="2400"/>
-        <w:gridCol w:w="2400"/>
-        <w:gridCol w:w="2400"/>
-        <w:gridCol w:w="2400"/>
-      </w:tblGrid>
-      <w:tr>
-        <w:tc>
-          <w:tcPr>
-            <w:tcW w:type="dxa" w:w="2400"/>
-            <w:tcBorders>
-              <w:top w:val="none"/>
-              <w:left w:val="none"/>
-              <w:bottom w:val="none"/>
-              <w:right w:val="none"/>
-            </w:tcBorders>
-          </w:tcPr>
-          <w:p>
-            <w:pPr>
-              <w:spacing w:after="30" w:before="30"/>
-            </w:pPr>
-            <w:r>
-              <w:rPr>
-                <w:rFonts w:ascii="Arial" w:cs="Arial" w:eastAsia="Arial" w:hAnsi="Arial"/>
-                <w:color w:val="1A1A1A"/>
-                <w:sz w:val="19"/>
-                <w:szCs w:val="19"/>
-              </w:rPr>
-              <w:t xml:space="preserve">Client-Facing Delivery</w:t>
-            </w:r>
-          </w:p>
-        </w:tc>
-        <w:tc>
-          <w:tcPr>
-            <w:tcW w:type="dxa" w:w="2400"/>
-            <w:tcBorders>
-              <w:top w:val="none"/>
-              <w:left w:val="none"/>
-              <w:bottom w:val="none"/>
-              <w:right w:val="none"/>
-            </w:tcBorders>
-          </w:tcPr>
-          <w:p>
-            <w:pPr>
-              <w:spacing w:after="30" w:before="30"/>
-            </w:pPr>
-            <w:r>
-              <w:rPr>
-                <w:rFonts w:ascii="Arial" w:cs="Arial" w:eastAsia="Arial" w:hAnsi="Arial"/>
-                <w:color w:val="1A1A1A"/>
-                <w:sz w:val="19"/>
-                <w:szCs w:val="19"/>
-              </w:rPr>
-              <w:t xml:space="preserve">Full-Stack Development</w:t>
-            </w:r>
-          </w:p>
-        </w:tc>
-        <w:tc>
-          <w:tcPr>
-            <w:tcW w:type="dxa" w:w="2400"/>
-            <w:tcBorders>
-              <w:top w:val="none"/>
-              <w:left w:val="none"/>
-              <w:bottom w:val="none"/>
-              <w:right w:val="none"/>
-            </w:tcBorders>
-          </w:tcPr>
-          <w:p>
-            <w:pPr>
-              <w:spacing w:after="30" w:before="30"/>
-            </w:pPr>
-            <w:r>
-              <w:rPr>
-                <w:rFonts w:ascii="Arial" w:cs="Arial" w:eastAsia="Arial" w:hAnsi="Arial"/>
-                <w:color w:val="1A1A1A"/>
-                <w:sz w:val="19"/>
-                <w:szCs w:val="19"/>
-              </w:rPr>
-              <w:t xml:space="preserve">Rapid Prototyping</w:t>
-            </w:r>
-          </w:p>
-        </w:tc>
-        <w:tc>
-          <w:tcPr>
-            <w:tcW w:type="dxa" w:w="2400"/>
-            <w:tcBorders>
-              <w:top w:val="none"/>
-              <w:left w:val="none"/>
-              <w:bottom w:val="none"/>
-              <w:right w:val="none"/>
-            </w:tcBorders>
-          </w:tcPr>
-          <w:p>
-            <w:pPr>
-              <w:spacing w:after="30" w:before="30"/>
-            </w:pPr>
-            <w:r>
-              <w:rPr>
-                <w:rFonts w:ascii="Arial" w:cs="Arial" w:eastAsia="Arial" w:hAnsi="Arial"/>
-                <w:color w:val="1A1A1A"/>
-                <w:sz w:val="19"/>
-                <w:szCs w:val="19"/>
-              </w:rPr>
-              <w:t xml:space="preserve">Cloud (AWS / Azure)</w:t>
-            </w:r>
-          </w:p>
-        </w:tc>
-      </w:tr>
-      <w:tr>
-        <w:tc>
-          <w:tcPr>
-            <w:tcW w:type="dxa" w:w="2400"/>
-            <w:tcBorders>
-              <w:top w:val="none"/>
-              <w:left w:val="none"/>
-              <w:bottom w:val="none"/>
-              <w:right w:val="none"/>
-            </w:tcBorders>
-          </w:tcPr>
-          <w:p>
-            <w:pPr>
-              <w:spacing w:after="30" w:before="30"/>
-            </w:pPr>
-            <w:r>
-              <w:rPr>
-                <w:rFonts w:ascii="Arial" w:cs="Arial" w:eastAsia="Arial" w:hAnsi="Arial"/>
-                <w:color w:val="1A1A1A"/>
-                <w:sz w:val="19"/>
-                <w:szCs w:val="19"/>
-              </w:rPr>
-              <w:t xml:space="preserve">Python (Advanced)</w:t>
-            </w:r>
-          </w:p>
-        </w:tc>
-        <w:tc>
-          <w:tcPr>
-            <w:tcW w:type="dxa" w:w="2400"/>
-            <w:tcBorders>
-              <w:top w:val="none"/>
-              <w:left w:val="none"/>
-              <w:bottom w:val="none"/>
-              <w:right w:val="none"/>
-            </w:tcBorders>
-          </w:tcPr>
-          <w:p>
-            <w:pPr>
-              <w:spacing w:after="30" w:before="30"/>
-            </w:pPr>
-            <w:r>
-              <w:rPr>
-                <w:rFonts w:ascii="Arial" w:cs="Arial" w:eastAsia="Arial" w:hAnsi="Arial"/>
-                <w:color w:val="1A1A1A"/>
-                <w:sz w:val="19"/>
-                <w:szCs w:val="19"/>
-              </w:rPr>
-              <w:t xml:space="preserve">React / TypeScript</w:t>
-            </w:r>
-          </w:p>
-        </w:tc>
-        <w:tc>
-          <w:tcPr>
-            <w:tcW w:type="dxa" w:w="2400"/>
-            <w:tcBorders>
-              <w:top w:val="none"/>
-              <w:left w:val="none"/>
-              <w:bottom w:val="none"/>
-              <w:right w:val="none"/>
-            </w:tcBorders>
-          </w:tcPr>
-          <w:p>
-            <w:pPr>
-              <w:spacing w:after="30" w:before="30"/>
-            </w:pPr>
-            <w:r>
-              <w:rPr>
-                <w:rFonts w:ascii="Arial" w:cs="Arial" w:eastAsia="Arial" w:hAnsi="Arial"/>
-                <w:color w:val="1A1A1A"/>
-                <w:sz w:val="19"/>
-                <w:szCs w:val="19"/>
-              </w:rPr>
-              <w:t xml:space="preserve">Data Pipelines</w:t>
-            </w:r>
-          </w:p>
-        </w:tc>
-        <w:tc>
-          <w:tcPr>
-            <w:tcW w:type="dxa" w:w="2400"/>
-            <w:tcBorders>
-              <w:top w:val="none"/>
-              <w:left w:val="none"/>
-              <w:bottom w:val="none"/>
-              <w:right w:val="none"/>
-            </w:tcBorders>
-          </w:tcPr>
-          <w:p>
-            <w:pPr>
-              <w:spacing w:after="30" w:before="30"/>
-            </w:pPr>
-            <w:r>
-              <w:rPr>
-                <w:rFonts w:ascii="Arial" w:cs="Arial" w:eastAsia="Arial" w:hAnsi="Arial"/>
-                <w:color w:val="1A1A1A"/>
-                <w:sz w:val="19"/>
-                <w:szCs w:val="19"/>
-              </w:rPr>
-              <w:t xml:space="preserve">Kubernetes / Docker</w:t>
-            </w:r>
-          </w:p>
-        </w:tc>
-      </w:tr>
-      <w:tr>
-        <w:tc>
-          <w:tcPr>
-            <w:tcW w:type="dxa" w:w="2400"/>
-            <w:tcBorders>
-              <w:top w:val="none"/>
-              <w:left w:val="none"/>
-              <w:bottom w:val="none"/>
-              <w:right w:val="none"/>
-            </w:tcBorders>
-          </w:tcPr>
-          <w:p>
-            <w:pPr>
-              <w:spacing w:after="30" w:before="30"/>
-            </w:pPr>
-            <w:r>
-              <w:rPr>
-                <w:rFonts w:ascii="Arial" w:cs="Arial" w:eastAsia="Arial" w:hAnsi="Arial"/>
-                <w:color w:val="1A1A1A"/>
-                <w:sz w:val="19"/>
-                <w:szCs w:val="19"/>
-              </w:rPr>
-              <w:t xml:space="preserve">System Architecture</w:t>
-            </w:r>
-          </w:p>
-        </w:tc>
-        <w:tc>
-          <w:tcPr>
-            <w:tcW w:type="dxa" w:w="2400"/>
-            <w:tcBorders>
-              <w:top w:val="none"/>
-              <w:left w:val="none"/>
-              <w:bottom w:val="none"/>
-              <w:right w:val="none"/>
-            </w:tcBorders>
-          </w:tcPr>
-          <w:p>
-            <w:pPr>
-              <w:spacing w:after="30" w:before="30"/>
-            </w:pPr>
-            <w:r>
-              <w:rPr>
-                <w:rFonts w:ascii="Arial" w:cs="Arial" w:eastAsia="Arial" w:hAnsi="Arial"/>
-                <w:color w:val="1A1A1A"/>
-                <w:sz w:val="19"/>
-                <w:szCs w:val="19"/>
-              </w:rPr>
-              <w:t xml:space="preserve">Stakeholder Mgmt</w:t>
-            </w:r>
-          </w:p>
-        </w:tc>
-        <w:tc>
-          <w:tcPr>
-            <w:tcW w:type="dxa" w:w="2400"/>
-            <w:tcBorders>
-              <w:top w:val="none"/>
-              <w:left w:val="none"/>
-              <w:bottom w:val="none"/>
-              <w:right w:val="none"/>
-            </w:tcBorders>
-          </w:tcPr>
-          <w:p>
-            <w:pPr>
-              <w:spacing w:after="30" w:before="30"/>
-            </w:pPr>
-            <w:r>
-              <w:rPr>
-                <w:rFonts w:ascii="Arial" w:cs="Arial" w:eastAsia="Arial" w:hAnsi="Arial"/>
-                <w:color w:val="1A1A1A"/>
-                <w:sz w:val="19"/>
-                <w:szCs w:val="19"/>
-              </w:rPr>
-              <w:t xml:space="preserve">API Design (REST)</w:t>
-            </w:r>
-          </w:p>
-        </w:tc>
-        <w:tc>
-          <w:tcPr>
-            <w:tcW w:type="dxa" w:w="2400"/>
-            <w:tcBorders>
-              <w:top w:val="none"/>
-              <w:left w:val="none"/>
-              <w:bottom w:val="none"/>
-              <w:right w:val="none"/>
-            </w:tcBorders>
-          </w:tcPr>
-          <w:p>
-            <w:pPr>
-              <w:spacing w:after="30" w:before="30"/>
-            </w:pPr>
-            <w:r>
-              <w:rPr>
-                <w:rFonts w:ascii="Arial" w:cs="Arial" w:eastAsia="Arial" w:hAnsi="Arial"/>
-                <w:color w:val="1A1A1A"/>
-                <w:sz w:val="19"/>
-                <w:szCs w:val="19"/>
-              </w:rPr>
-              <w:t xml:space="preserve">Technical Discovery</w:t>
-            </w:r>
-          </w:p>
-        </w:tc>
-      </w:tr>
-    </w:tbl>
+    <w:p>
+      <w:pPr>
+        <w:spacing w:after="25" w:before="25"/>
+      </w:pPr>
+      <w:r>
+        <w:rPr>
+          <w:rFonts w:ascii="Arial" w:cs="Arial" w:eastAsia="Arial" w:hAnsi="Arial"/>
+          <w:color w:val="1A1A1A"/>
+          <w:sz w:val="19"/>
+          <w:szCs w:val="19"/>
+        </w:rPr>
+        <w:t xml:space="preserve">Client-Facing Delivery  |  Full-Stack Development  |  Rapid Prototyping  |  Cloud (AWS / Azure)</w:t>
+      </w:r>
+    </w:p>
+    <w:p>
+      <w:pPr>
+        <w:spacing w:after="25" w:before="25"/>
+      </w:pPr>
+      <w:r>
+        <w:rPr>
+          <w:rFonts w:ascii="Arial" w:cs="Arial" w:eastAsia="Arial" w:hAnsi="Arial"/>
+          <w:color w:val="1A1A1A"/>
+          <w:sz w:val="19"/>
+          <w:szCs w:val="19"/>
+        </w:rPr>
+        <w:t xml:space="preserve">Python (Advanced)  |  React / TypeScript  |  Data Pipelines  |  Kubernetes / Docker</w:t>
+      </w:r>
+    </w:p>
+    <w:p>
+      <w:pPr>
+        <w:spacing w:after="25" w:before="25"/>
+      </w:pPr>
+      <w:r>
+        <w:rPr>
+          <w:rFonts w:ascii="Arial" w:cs="Arial" w:eastAsia="Arial" w:hAnsi="Arial"/>
+          <w:color w:val="1A1A1A"/>
+          <w:sz w:val="19"/>
+          <w:szCs w:val="19"/>
+        </w:rPr>
+        <w:t xml:space="preserve">System Architecture  |  Stakeholder Mgmt  |  API Design (REST)  |  Technical Discovery</w:t>
+      </w:r>
+    </w:p>
     <w:p>
       <w:pPr>
         <w:pBdr>
@@ -448,7 +161,6 @@
           <w:b/>
           <w:bCs/>
           <w:color w:val="2563EB"/>
-          <w:spacing w:val="40"/>
           <w:sz w:val="23"/>
           <w:szCs w:val="23"/>
         </w:rPr>
@@ -468,7 +180,7 @@
           <w:sz w:val="22"/>
           <w:szCs w:val="22"/>
         </w:rPr>
-        <w:t xml:space="preserve">Technical Lead – Forward Deployed, Autonomous Driving Platform</w:t>
+        <w:t xml:space="preserve">Technical Lead - Forward Deployed, Autonomous Driving Platform</w:t>
       </w:r>
       <w:r>
         <w:rPr>
@@ -477,7 +189,7 @@
           <w:sz w:val="19"/>
           <w:szCs w:val="19"/>
         </w:rPr>
-        <w:t xml:space="preserve">  |  Jan 2024 – Present</w:t>
+        <w:t xml:space="preserve">  |  Jan 2024 - Present</w:t>
       </w:r>
     </w:p>
     <w:p>
@@ -552,7 +264,7 @@
           <w:sz w:val="20"/>
           <w:szCs w:val="20"/>
         </w:rPr>
-        <w:t xml:space="preserve">Translate client requirements from product and validation stakeholders into technical architecture — designed and shipped the Parameter Filtering Service enabling real-time CAN signal analytics (speed, yaw rate, steering angle) across billion-scale DynamoDB datasets with server-side FilterExpression, eliminating 30–60s runtime S3 reads</w:t>
+        <w:t xml:space="preserve">Translate client requirements from product and validation stakeholders into technical architecture -- designed and shipped the Parameter Filtering Service enabling real-time CAN signal analytics (speed, yaw rate, steering angle) across billion-scale DynamoDB datasets with server-side FilterExpression, eliminating 30-60s runtime S3 reads</w:t>
       </w:r>
     </w:p>
     <w:p>
@@ -600,7 +312,7 @@
           <w:sz w:val="20"/>
           <w:szCs w:val="20"/>
         </w:rPr>
-        <w:t xml:space="preserve">Architected and deployed CAN signal processing pipeline — automated driving maneuver detection (lane changes, turns, U-turns) from raw GPS + CAN data using complementary heading filters, empirical steering models, and rolling-median road baselines at 10Hz</w:t>
+        <w:t xml:space="preserve">Architected and deployed CAN signal processing pipeline -- automated driving maneuver detection (lane changes, turns, U-turns) from raw GPS + CAN data using complementary heading filters, empirical steering models, and rolling-median road baselines at 10Hz</w:t>
       </w:r>
     </w:p>
     <w:p>
@@ -648,7 +360,7 @@
           <w:sz w:val="20"/>
           <w:szCs w:val="20"/>
         </w:rPr>
-        <w:t xml:space="preserve">Led a team of 6–8 engineers; ran weekly client demos, sprint reviews, and technical deep-dives with OEM validation leads, reducing requirement-to-delivery cycle from 4 weeks to 10 days</w:t>
+        <w:t xml:space="preserve">Led a team of 6-8 engineers; ran weekly client demos, sprint reviews, and technical deep-dives with OEM validation leads, reducing requirement-to-delivery cycle from 4 weeks to 10 days</w:t>
       </w:r>
     </w:p>
     <w:p>
@@ -688,7 +400,7 @@
           <w:sz w:val="22"/>
           <w:szCs w:val="22"/>
         </w:rPr>
-        <w:t xml:space="preserve">Senior Software Engineer – Data Platform &amp; Analytics</w:t>
+        <w:t xml:space="preserve">Senior Software Engineer - Data Platform &amp; Analytics</w:t>
       </w:r>
       <w:r>
         <w:rPr>
@@ -697,7 +409,7 @@
           <w:sz w:val="19"/>
           <w:szCs w:val="19"/>
         </w:rPr>
-        <w:t xml:space="preserve">  |  Jan 2021 – Dec 2023</w:t>
+        <w:t xml:space="preserve">  |  Jan 2021 - Dec 2023</w:t>
       </w:r>
     </w:p>
     <w:p>
@@ -772,7 +484,7 @@
           <w:sz w:val="20"/>
           <w:szCs w:val="20"/>
         </w:rPr>
-        <w:t xml:space="preserve">Built interactive data visualization dashboards using React, TypeScript, Chart.js, and Recharts for disengagement analysis, ODD (Operational Design Domain) registration, and scenario search — used daily by 100+ client engineers</w:t>
+        <w:t xml:space="preserve">Built interactive data visualization dashboards using React, TypeScript, Chart.js, and Recharts for disengagement analysis, ODD (Operational Design Domain) registration, and scenario search -- used daily by 100+ client engineers</w:t>
       </w:r>
     </w:p>
     <w:p>
@@ -908,7 +620,7 @@
           <w:sz w:val="22"/>
           <w:szCs w:val="22"/>
         </w:rPr>
-        <w:t xml:space="preserve">Software Engineer – Test Automation &amp; Data Engineering</w:t>
+        <w:t xml:space="preserve">Software Engineer - Test Automation &amp; Data Engineering</w:t>
       </w:r>
       <w:r>
         <w:rPr>
@@ -917,7 +629,7 @@
           <w:sz w:val="19"/>
           <w:szCs w:val="19"/>
         </w:rPr>
-        <w:t xml:space="preserve">  |  Jun 2019 – Dec 2020</w:t>
+        <w:t xml:space="preserve">  |  Jun 2019 - Dec 2020</w:t>
       </w:r>
     </w:p>
     <w:p>
@@ -1128,7 +840,6 @@
           <w:b/>
           <w:bCs/>
           <w:color w:val="2563EB"/>
-          <w:spacing w:val="40"/>
           <w:sz w:val="23"/>
           <w:szCs w:val="23"/>
         </w:rPr>
@@ -1323,7 +1034,6 @@
           <w:b/>
           <w:bCs/>
           <w:color w:val="2563EB"/>
-          <w:spacing w:val="40"/>
           <w:sz w:val="23"/>
           <w:szCs w:val="23"/>
         </w:rPr>
@@ -1362,7 +1072,7 @@
           <w:sz w:val="20"/>
           <w:szCs w:val="20"/>
         </w:rPr>
-        <w:t xml:space="preserve">Full-stack cloud platform (AWS EKS + React) for validating autonomous driving scenarios at scale — parameter filtering, GPS map search, disengagement analysis, ODD registration, CAN maneuver detection. Deployed in production serving 500+ client engineers daily.</w:t>
+        <w:t xml:space="preserve">Full-stack cloud platform (AWS EKS + React) for validating autonomous driving scenarios at scale -- parameter filtering, GPS map search, disengagement analysis, ODD registration, CAN maneuver detection. Deployed in production serving 500+ client engineers daily.</w:t>
       </w:r>
     </w:p>
     <w:p>
@@ -1448,7 +1158,6 @@
           <w:b/>
           <w:bCs/>
           <w:color w:val="2563EB"/>
-          <w:spacing w:val="40"/>
           <w:sz w:val="23"/>
           <w:szCs w:val="23"/>
         </w:rPr>
@@ -1468,7 +1177,7 @@
           <w:sz w:val="20"/>
           <w:szCs w:val="20"/>
         </w:rPr>
-        <w:t xml:space="preserve">Master’s Degree – Artificial Intelligence &amp; Machine Learning</w:t>
+        <w:t xml:space="preserve">Master's Degree - Artificial Intelligence &amp; Machine Learning</w:t>
       </w:r>
       <w:r>
         <w:rPr>
@@ -1477,7 +1186,7 @@
           <w:sz w:val="18"/>
           <w:szCs w:val="18"/>
         </w:rPr>
-        <w:t xml:space="preserve">  |  2022 – 2024</w:t>
+        <w:t xml:space="preserve">  |  2022 - 2024</w:t>
       </w:r>
     </w:p>
     <w:p>
@@ -1507,7 +1216,7 @@
           <w:sz w:val="20"/>
           <w:szCs w:val="20"/>
         </w:rPr>
-        <w:t xml:space="preserve">Bachelor of Engineering – Electronics &amp; Communication</w:t>
+        <w:t xml:space="preserve">Bachelor of Engineering - Electronics &amp; Communication</w:t>
       </w:r>
       <w:r>
         <w:rPr>
@@ -1516,7 +1225,7 @@
           <w:sz w:val="18"/>
           <w:szCs w:val="18"/>
         </w:rPr>
-        <w:t xml:space="preserve">  |  2014 – 2018</w:t>
+        <w:t xml:space="preserve">  |  2014 - 2018</w:t>
       </w:r>
     </w:p>
     <w:p>
@@ -1546,131 +1255,130 @@
           <w:b/>
           <w:bCs/>
           <w:color w:val="2563EB"/>
-          <w:spacing w:val="40"/>
           <w:sz w:val="23"/>
           <w:szCs w:val="23"/>
         </w:rPr>
-        <w:t xml:space="preserve">CERTIFICATIONS</w:t>
-      </w:r>
-    </w:p>
-    <w:p>
-      <w:pPr>
-        <w:spacing w:after="30" w:before="30"/>
-        <w:ind w:left="360" w:hanging="360"/>
-      </w:pPr>
-      <w:r>
-        <w:rPr>
-          <w:rFonts w:ascii="Arial" w:cs="Arial" w:eastAsia="Arial" w:hAnsi="Arial"/>
-          <w:color w:val="2563EB"/>
-          <w:sz w:val="20"/>
-          <w:szCs w:val="20"/>
-        </w:rPr>
-        <w:t xml:space="preserve">•  </w:t>
-      </w:r>
-      <w:r>
-        <w:rPr>
-          <w:rFonts w:ascii="Arial" w:cs="Arial" w:eastAsia="Arial" w:hAnsi="Arial"/>
-          <w:color w:val="1A1A1A"/>
-          <w:sz w:val="20"/>
-          <w:szCs w:val="20"/>
-        </w:rPr>
-        <w:t xml:space="preserve">AWS Certified Solutions Architect – Associate</w:t>
-      </w:r>
-    </w:p>
-    <w:p>
-      <w:pPr>
-        <w:spacing w:after="30" w:before="30"/>
-        <w:ind w:left="360" w:hanging="360"/>
-      </w:pPr>
-      <w:r>
-        <w:rPr>
-          <w:rFonts w:ascii="Arial" w:cs="Arial" w:eastAsia="Arial" w:hAnsi="Arial"/>
-          <w:color w:val="2563EB"/>
-          <w:sz w:val="20"/>
-          <w:szCs w:val="20"/>
-        </w:rPr>
-        <w:t xml:space="preserve">•  </w:t>
-      </w:r>
-      <w:r>
-        <w:rPr>
-          <w:rFonts w:ascii="Arial" w:cs="Arial" w:eastAsia="Arial" w:hAnsi="Arial"/>
-          <w:color w:val="1A1A1A"/>
-          <w:sz w:val="20"/>
-          <w:szCs w:val="20"/>
-        </w:rPr>
-        <w:t xml:space="preserve">AWS Certified Developer – Associate</w:t>
-      </w:r>
-    </w:p>
-    <w:p>
-      <w:pPr>
-        <w:spacing w:after="30" w:before="30"/>
-        <w:ind w:left="360" w:hanging="360"/>
-      </w:pPr>
-      <w:r>
-        <w:rPr>
-          <w:rFonts w:ascii="Arial" w:cs="Arial" w:eastAsia="Arial" w:hAnsi="Arial"/>
-          <w:color w:val="2563EB"/>
-          <w:sz w:val="20"/>
-          <w:szCs w:val="20"/>
-        </w:rPr>
-        <w:t xml:space="preserve">•  </w:t>
-      </w:r>
-      <w:r>
-        <w:rPr>
-          <w:rFonts w:ascii="Arial" w:cs="Arial" w:eastAsia="Arial" w:hAnsi="Arial"/>
-          <w:color w:val="1A1A1A"/>
-          <w:sz w:val="20"/>
-          <w:szCs w:val="20"/>
-        </w:rPr>
-        <w:t xml:space="preserve">HashiCorp Certified: Terraform Associate</w:t>
-      </w:r>
-    </w:p>
-    <w:p>
-      <w:pPr>
-        <w:spacing w:after="30" w:before="30"/>
-        <w:ind w:left="360" w:hanging="360"/>
-      </w:pPr>
-      <w:r>
-        <w:rPr>
-          <w:rFonts w:ascii="Arial" w:cs="Arial" w:eastAsia="Arial" w:hAnsi="Arial"/>
-          <w:color w:val="2563EB"/>
-          <w:sz w:val="20"/>
-          <w:szCs w:val="20"/>
-        </w:rPr>
-        <w:t xml:space="preserve">•  </w:t>
-      </w:r>
-      <w:r>
-        <w:rPr>
-          <w:rFonts w:ascii="Arial" w:cs="Arial" w:eastAsia="Arial" w:hAnsi="Arial"/>
-          <w:color w:val="1A1A1A"/>
-          <w:sz w:val="20"/>
-          <w:szCs w:val="20"/>
-        </w:rPr>
-        <w:t xml:space="preserve">Kubernetes Application Developer (CKAD)</w:t>
-      </w:r>
-    </w:p>
-    <w:p>
-      <w:pPr>
-        <w:spacing w:after="30" w:before="30"/>
-        <w:ind w:left="360" w:hanging="360"/>
-      </w:pPr>
-      <w:r>
-        <w:rPr>
-          <w:rFonts w:ascii="Arial" w:cs="Arial" w:eastAsia="Arial" w:hAnsi="Arial"/>
-          <w:color w:val="2563EB"/>
-          <w:sz w:val="20"/>
-          <w:szCs w:val="20"/>
-        </w:rPr>
-        <w:t xml:space="preserve">•  </w:t>
-      </w:r>
-      <w:r>
-        <w:rPr>
-          <w:rFonts w:ascii="Arial" w:cs="Arial" w:eastAsia="Arial" w:hAnsi="Arial"/>
-          <w:color w:val="1A1A1A"/>
-          <w:sz w:val="20"/>
-          <w:szCs w:val="20"/>
-        </w:rPr>
-        <w:t xml:space="preserve">Meta – Front-End Developer Professional Certificate</w:t>
+        <w:t xml:space="preserve">PROFESSIONAL DEVELOPMENT</w:t>
+      </w:r>
+    </w:p>
+    <w:p>
+      <w:pPr>
+        <w:spacing w:after="30" w:before="30"/>
+        <w:ind w:left="360" w:hanging="360"/>
+      </w:pPr>
+      <w:r>
+        <w:rPr>
+          <w:rFonts w:ascii="Arial" w:cs="Arial" w:eastAsia="Arial" w:hAnsi="Arial"/>
+          <w:color w:val="2563EB"/>
+          <w:sz w:val="20"/>
+          <w:szCs w:val="20"/>
+        </w:rPr>
+        <w:t xml:space="preserve">•  </w:t>
+      </w:r>
+      <w:r>
+        <w:rPr>
+          <w:rFonts w:ascii="Arial" w:cs="Arial" w:eastAsia="Arial" w:hAnsi="Arial"/>
+          <w:color w:val="1A1A1A"/>
+          <w:sz w:val="20"/>
+          <w:szCs w:val="20"/>
+        </w:rPr>
+        <w:t xml:space="preserve">AWS Certified Solutions Architect - Associate (In Progress)</w:t>
+      </w:r>
+    </w:p>
+    <w:p>
+      <w:pPr>
+        <w:spacing w:after="30" w:before="30"/>
+        <w:ind w:left="360" w:hanging="360"/>
+      </w:pPr>
+      <w:r>
+        <w:rPr>
+          <w:rFonts w:ascii="Arial" w:cs="Arial" w:eastAsia="Arial" w:hAnsi="Arial"/>
+          <w:color w:val="2563EB"/>
+          <w:sz w:val="20"/>
+          <w:szCs w:val="20"/>
+        </w:rPr>
+        <w:t xml:space="preserve">•  </w:t>
+      </w:r>
+      <w:r>
+        <w:rPr>
+          <w:rFonts w:ascii="Arial" w:cs="Arial" w:eastAsia="Arial" w:hAnsi="Arial"/>
+          <w:color w:val="1A1A1A"/>
+          <w:sz w:val="20"/>
+          <w:szCs w:val="20"/>
+        </w:rPr>
+        <w:t xml:space="preserve">Master's in AI/ML - Coventry University, UK (2024)</w:t>
+      </w:r>
+    </w:p>
+    <w:p>
+      <w:pPr>
+        <w:spacing w:after="30" w:before="30"/>
+        <w:ind w:left="360" w:hanging="360"/>
+      </w:pPr>
+      <w:r>
+        <w:rPr>
+          <w:rFonts w:ascii="Arial" w:cs="Arial" w:eastAsia="Arial" w:hAnsi="Arial"/>
+          <w:color w:val="2563EB"/>
+          <w:sz w:val="20"/>
+          <w:szCs w:val="20"/>
+        </w:rPr>
+        <w:t xml:space="preserve">•  </w:t>
+      </w:r>
+      <w:r>
+        <w:rPr>
+          <w:rFonts w:ascii="Arial" w:cs="Arial" w:eastAsia="Arial" w:hAnsi="Arial"/>
+          <w:color w:val="1A1A1A"/>
+          <w:sz w:val="20"/>
+          <w:szCs w:val="20"/>
+        </w:rPr>
+        <w:t xml:space="preserve">DeepLearning.AI - LangChain for LLM Application Development</w:t>
+      </w:r>
+    </w:p>
+    <w:p>
+      <w:pPr>
+        <w:spacing w:after="30" w:before="30"/>
+        <w:ind w:left="360" w:hanging="360"/>
+      </w:pPr>
+      <w:r>
+        <w:rPr>
+          <w:rFonts w:ascii="Arial" w:cs="Arial" w:eastAsia="Arial" w:hAnsi="Arial"/>
+          <w:color w:val="2563EB"/>
+          <w:sz w:val="20"/>
+          <w:szCs w:val="20"/>
+        </w:rPr>
+        <w:t xml:space="preserve">•  </w:t>
+      </w:r>
+      <w:r>
+        <w:rPr>
+          <w:rFonts w:ascii="Arial" w:cs="Arial" w:eastAsia="Arial" w:hAnsi="Arial"/>
+          <w:color w:val="1A1A1A"/>
+          <w:sz w:val="20"/>
+          <w:szCs w:val="20"/>
+        </w:rPr>
+        <w:t xml:space="preserve">DeepLearning.AI - Building Agentic RAG with LlamaIndex</w:t>
+      </w:r>
+    </w:p>
+    <w:p>
+      <w:pPr>
+        <w:spacing w:after="30" w:before="30"/>
+        <w:ind w:left="360" w:hanging="360"/>
+      </w:pPr>
+      <w:r>
+        <w:rPr>
+          <w:rFonts w:ascii="Arial" w:cs="Arial" w:eastAsia="Arial" w:hAnsi="Arial"/>
+          <w:color w:val="2563EB"/>
+          <w:sz w:val="20"/>
+          <w:szCs w:val="20"/>
+        </w:rPr>
+        <w:t xml:space="preserve">•  </w:t>
+      </w:r>
+      <w:r>
+        <w:rPr>
+          <w:rFonts w:ascii="Arial" w:cs="Arial" w:eastAsia="Arial" w:hAnsi="Arial"/>
+          <w:color w:val="1A1A1A"/>
+          <w:sz w:val="20"/>
+          <w:szCs w:val="20"/>
+        </w:rPr>
+        <w:t xml:space="preserve">DeepLearning.AI - Prompt Engineering for Developers</w:t>
       </w:r>
     </w:p>
     <w:p>

</xml_diff>